<commit_message>
feat(templates): renombrar los campos a nombres legibles
Los campos se llamaban dear_line, host_line, confirm_line, role_label,
fee_lines, etc. — nombres internos que no dicen nada. Pasan a nombres en
ingles simple: greeting, host, confirmation_paragraph, role,
payment_lines, signature, competition, heading, letter_date, year,
confirmation_email, banking_paragraph. De paso se unifican bcla_date y
bcla_title/lsb_title, que eran distintos por template sin motivo.

Como los cuatro .docx built-in usan estos nombres, se regeneran con
scripts/build_letter_templates.py. Verificado: los cinco casos (GENERIC,
WCQ, BCLA RS, BCLA F4, LSB) siguen dando secuencia de parrafos identica.

Compatibilidad: LEGACY_FIELD_ALIASES mapea los nombres viejos a los
nuevos en el render y en la validacion, asi que un .docx bajado con los
nombres anteriores sigue funcionando; la UI solo lista los nuevos.

Co-Authored-By: Claude Opus 4.8 <noreply@anthropic.com>
</commit_message>
<xml_diff>
--- a/templates/BCLA_TEMPLATE_TPL.docx
+++ b/templates/BCLA_TEMPLATE_TPL.docx
@@ -161,7 +161,7 @@
           <w:color w:val="2A2A2A"/>
           <w:sz w:val="20"/>
         </w:rPr>
-        <w:t>{{r bcla_date }}</w:t>
+        <w:t>{{r letter_date }}</w:t>
       </w:r>
     </w:p>
     <w:p>
@@ -188,7 +188,7 @@
           <w:b w:val="0"/>
           <w:color w:val="2A2A2A"/>
         </w:rPr>
-        <w:t>{{r bcla_title }}</w:t>
+        <w:t>{{r heading }}</w:t>
       </w:r>
     </w:p>
     <w:p/>
@@ -199,7 +199,7 @@
           <w:b w:val="0"/>
           <w:color w:val="2A2A2A"/>
         </w:rPr>
-        <w:t>{{r dear_line }}</w:t>
+        <w:t>{{r greeting }}</w:t>
       </w:r>
     </w:p>
     <w:p/>
@@ -214,7 +214,7 @@
           <w:color w:val="2A2A2A"/>
           <w:sz w:val="20"/>
         </w:rPr>
-        <w:t>By way of this letter, we confirm your acceptance for your assignment as {{ role_label }} for the {{ competition_name }} {{ competition_year }}.</w:t>
+        <w:t>By way of this letter, we confirm your acceptance for your assignment as {{ role }} for the {{ competition }} {{ year }}.</w:t>
       </w:r>
     </w:p>
     <w:p/>
@@ -439,7 +439,7 @@
           <w:b w:val="0"/>
           <w:color w:val="2A2A2A"/>
         </w:rPr>
-        <w:t>{%p for fee in fee_lines %}</w:t>
+        <w:t>{%p for fee in payment_lines %}</w:t>
       </w:r>
     </w:p>
     <w:p>
@@ -507,7 +507,7 @@
           <w:color w:val="2A2A2A"/>
           <w:sz w:val="20"/>
         </w:rPr>
-        <w:t>{{ banking_line }}</w:t>
+        <w:t>{{ banking_paragraph }}</w:t>
       </w:r>
     </w:p>
     <w:p/>

</xml_diff>